<commit_message>
Close partial review items: unified update search with ERIC, registry-linked trials, final rebuild (118 trials, 121 reports)
Co-Authored-By: Claude Sonnet 5.5 <noreply@anthropic.com>
Claude-Session: https://claude.ai/code/session_01WHdoH2brsuf2zg1uU5YHyB
</commit_message>
<xml_diff>
--- a/paper/manuscript_blinded.docx
+++ b/paper/manuscript_blinded.docx
@@ -126,7 +126,7 @@
           <w:sz w:val="24"/>
           <w:szCs w:val="24"/>
         </w:rPr>
-        <w:t xml:space="preserve"> Of 4,960 records, 2,461 were screened and 294 reports assessed. We included 119 reports of 116 trials (26,918 participants in 107 trials reporting numbers). Most trials (64.7%) were first reported from 2023 onwards, and 72 studied healthcare workers. Web programmes (49) and smartphone apps (21) predominated; 20 trials tested non-psychological mechanisms. Waitlist controls were used in 40.0% of trials from 2023. About half of the abstracts (58) named the burnout instrument, and 31 gave a registration number. Of 15 randomised registrations completed by 2023, 6 had no located results.</w:t>
+        <w:t xml:space="preserve"> Of 4,991 records, 2,481 were screened and 301 reports assessed. We included 121 reports of 118 trials (27,088 participants in 109 trials reporting numbers). Most trials (64.4%) were first reported from 2023 onwards, and 73 studied healthcare workers. Web programmes (50) and smartphone apps (21) predominated; 21 trials tested non-psychological mechanisms. Waitlist controls were used in 40.8% of trials from 2023. About half of the abstracts (58) named the burnout instrument, and 31 gave a registration number. Of 15 randomised registrations completed by 2023, 4 had no located results.</w:t>
       </w:r>
     </w:p>
     <w:p>
@@ -472,7 +472,7 @@
           <w:sz w:val="24"/>
           <w:szCs w:val="24"/>
         </w:rPr>
-        <w:t xml:space="preserve"> The protocol was not registered in advance; a retrospective protocol, written after the searches and listing every step added after the work began, is provided with the supplementary files. Because the review maps evidence, we did not assess risk of bias or synthesise effect sizes.</w:t>
+        <w:t xml:space="preserve"> The protocol was not registered in advance (a retrospective protocol is supplied). Because the review maps evidence, we did not assess risk of bias or synthesise effect sizes.</w:t>
       </w:r>
     </w:p>
     <w:p>
@@ -536,7 +536,7 @@
           <w:sz w:val="24"/>
           <w:szCs w:val="24"/>
         </w:rPr>
-        <w:t xml:space="preserve">The main search combined four concept blocks (burnout, digital delivery, a psychological or behavioural intervention term and randomised design) in Europe PMC, OpenAlex and ERIC (26 September 2026) and in Web of Science and Scopus (17 September 2026). Because the eligibility criteria admitted any mechanism, this strategy was too narrow. We therefore repeated the search without the intervention block (Europe PMC and OpenAlex, 28 September; Web of Science and Scopus, 29 September 2026), searched PubMed with the Medical Subject Heading "Burnout, Professional" and added further delivery terms (29 September 2026). Finally, on 18 October 2026, we ran one unified strategy (burnout AND any digital-delivery term AND randomised design) in Europe PMC (all years) and, for records published from 1 September 2026, in OpenAlex and PubMed. Web of Science, Scopus and ERIC were not searched again after 29, 29 and 26 September 2026. ClinicalTrials.gov was searched on 28 September 2026 for completed interventional registrations with burnout as a condition and a digital term. We did not search PsycINFO, Embase or the Cochrane Central Register of Controlled Trials (no access) and did not check reference lists. A unified Europe PMC search alone retrieved 81 of the 119 included reports (68%), so no single database was sufficient. Complete strings, dates and numbers of records are in Supplementary Appendix A and Table S2.</w:t>
+        <w:t xml:space="preserve">The main search combined four concept blocks (burnout, digital delivery, a psychological or behavioural intervention term and randomised design) in Europe PMC, OpenAlex and ERIC (26 September 2026) and in Web of Science and Scopus (17 September 2026). Because the eligibility criteria admitted any mechanism, this strategy was too narrow. We therefore repeated the search without the intervention block (Europe PMC and OpenAlex, 28 September; Web of Science and Scopus, 29 September 2026), searched PubMed with the Medical Subject Heading "Burnout, Professional" and added further delivery terms (29 September 2026). Finally, on 18 October 2026, we ran one unified strategy (burnout AND any digital-delivery term AND randomised design) in Europe PMC and ERIC (all years) and, for records published from 1 September 2026, in OpenAlex and PubMed. Web of Science and Scopus were not searched again after 29 September 2026. ClinicalTrials.gov was searched on 28 September 2026 for completed interventional registrations with burnout as a condition and a digital term. We did not search PsycINFO, Embase or the Cochrane Central Register of Controlled Trials (no access). We checked the reference lists of five earlier reviews; none led to a further eligible trial (Supplementary Section S2). A unified Europe PMC search alone retrieved 81 of the 121 included reports (67%), so no single database was sufficient. Complete strings, dates and numbers of records are in Supplementary Appendix A and Table S2.</w:t>
       </w:r>
     </w:p>
     <w:p>
@@ -568,7 +568,7 @@
           <w:sz w:val="24"/>
           <w:szCs w:val="24"/>
         </w:rPr>
-        <w:t xml:space="preserve">Records were de-duplicated and screened with a rule-based classifier that could only exclude records. The first reviewer was an AI assistant (Section 2.7), which read every remaining record and proposed decisions; the corresponding author decided borderline reports. Eligibility was assessed from titles and abstracts; the full text was consulted for 15 reports in which the abstract was ambiguous or discrepant or the human reviewer disagreed. We estimated the screening error from a random sample of 45 excluded records.</w:t>
+        <w:t xml:space="preserve">Records were de-duplicated and screened with a rule-based classifier that could only exclude records. The first reviewer was an AI assistant (Section 2.7), which read every remaining record and proposed decisions; the corresponding author decided borderline reports. Eligibility was assessed from titles and abstracts; the full text was consulted for 16 reports in which the abstract was ambiguous or discrepant or the human reviewer disagreed. We estimated the screening error from a random sample of 45 excluded records.</w:t>
       </w:r>
       <w:r>
         <w:rPr>
@@ -617,7 +617,7 @@
           <w:sz w:val="24"/>
           <w:szCs w:val="24"/>
         </w:rPr>
-        <w:t xml:space="preserve">Each trial was charted with one value per variable: occupational group, delivery mode, intervention approach and mechanism, comparator, human support, burnout instrument, participants (randomised, or analysed where only that was reported) and year of first report. Two heterogeneous groups ("other psychological" approaches and "employees in other sectors") were split by rules written before recoding, and all their trials were recoded with the same rules. Where the abstract did not name the instrument, we took it from the full text; three trials stayed undetermined. Two further variables were coded from abstracts only and are descriptive: five reporting indicators (named randomisation method, blinding statement, attrition numbers, registration number and analysis population), each recorded as stated or not stated in the abstract, and the direction of the burnout result as reported by the authors (six categories). They are neither quality ratings nor effect estimates, and an indicator missing from an abstract does not show that the procedure was omitted. The human reviewer coded a random 20% sample (23 of the 113 trials included at that stage) blind to the first coding. The rules that the comparison exposed (a randomisation method counts only if named; "favours the intervention" requires a benefit on the total score or on every dimension reported) were then applied to all trials.</w:t>
+        <w:t xml:space="preserve">Each trial was charted with one value per variable: occupational group, delivery mode, intervention approach and mechanism, comparator, human support, burnout instrument, participants (randomised, or analysed where only that was reported) and year of first report. Two heterogeneous groups ("other psychological" approaches and "employees in other sectors") were split by rules written before recoding, and all their trials were recoded with the same rules. Where the abstract did not name the instrument, we took it from the full text; four trials stayed undetermined. Two further variables were coded from abstracts only and are descriptive: five reporting indicators (named randomisation method, blinding statement, attrition numbers, registration number and analysis population), each recorded as stated or not stated in the abstract, and the direction of the burnout result as reported by the authors (six categories). They are neither quality ratings nor effect estimates, and an indicator missing from an abstract does not show that the procedure was omitted. The human reviewer coded a random 20% sample (23 of the 113 trials included at that stage) blind to the first coding. The rules that the comparison exposed (a randomisation method counts only if named; "favours the intervention" requires a benefit on the total score or on every dimension reported) were then applied to all trials.</w:t>
       </w:r>
     </w:p>
     <w:p>
@@ -729,7 +729,7 @@
           <w:sz w:val="24"/>
           <w:szCs w:val="24"/>
         </w:rPr>
-        <w:t xml:space="preserve">The searches identified 4,960 records; 2,499 duplicates and non-article records were removed and 2,461 records were screened. Of 273 reports assessed from the databases, 155 were excluded (25 were not primary reports, 21 were not randomised, 38 did not study workers, 32 were not digitally delivered, 39 did not report burnout as an outcome); 118 were included, and the registry added one (Figure 1). In total, 119 reports of 116 trials were included. The searches added after the main search found 30 of the 116 trials (25.9%), 11 of them with non-psychological mechanisms, among them the ambient AI scribe trials. The random sample of 45 excluded records contained no eligible report (0 of 45; exact 95% confidence interval 0% to 7.9%). In the blind comparison of 30 reports the reviewers agreed on 24 (80%; kappa 0.60, 95% confidence interval 0.31 to 0.89); if the two partly digital interventions were counted as excluded, agreement was 73% (kappa 0.47). One first-reviewer decision was reversed after the full text was read, and four exclusions were confirmed (Supplementary Section S6).</w:t>
+        <w:t xml:space="preserve">The searches identified 4,991 records; 2,510 duplicates and non-article records were removed and 2,481 records were screened. Of 279 reports assessed from the databases, 160 were excluded (26 were not primary reports, 22 were not randomised, 40 did not study workers, 33 were not digitally delivered, 39 did not report burnout as an outcome); 119 were included, and the registry added 2 (Figure 1). In total, 121 reports of 118 trials were included. The searches added after the main search found 31 of the 118 trials (26.3%), 12 of them with non-psychological mechanisms, among them the ambient AI scribe trials. The random sample of 45 excluded records contained no eligible report (0 of 45; exact 95% confidence interval 0% to 7.9%). In the blind comparison of 30 reports the reviewers agreed on 24 (80%; kappa 0.60, 95% confidence interval 0.31 to 0.89); if the two partly digital interventions were counted as excluded, agreement was 73% (kappa 0.47).</w:t>
       </w:r>
     </w:p>
     <w:p>
@@ -799,7 +799,7 @@
           <w:sz w:val="24"/>
           <w:szCs w:val="24"/>
         </w:rPr>
-        <w:t xml:space="preserve"> PRISMA 2020 flow diagram. Reports are the unit of counting up to the final box; the included reports belong to 116 trials.</w:t>
+        <w:t xml:space="preserve"> PRISMA 2020 flow diagram. Reports are the unit of counting up to the final box; the included reports belong to 118 trials.</w:t>
       </w:r>
     </w:p>
     <w:p>
@@ -831,7 +831,7 @@
           <w:sz w:val="24"/>
           <w:szCs w:val="24"/>
         </w:rPr>
-        <w:t xml:space="preserve">Table 1 summarises the 116 trials (Supplementary Appendix C). The 107 trials that reported sample size enrolled 26,918 participants (median 111, interquartile range 66-237). Healthcare workers were studied in 72 (62.1%) trials, mental-health and social-care professionals in 7, teachers in 15 and employees of other sectors in 22. Of the trials, 75 (64.7%) were first reported from 2023 onwards (Figure 2); the share studying healthcare workers rose from 23.5% before 2020 to 70.8% in 2020-2022 and 68.0% from 2023, and live online group sessions, absent before 2020, were used in 22 trials from 2023. Web programmes (49 trials) and smartphone apps (21) were the commonest delivery modes. Mindfulness was the most frequent psychological approach (23 trials), found in 7 of the 8 occupational groups, and all 6 coaching trials were in physicians (Figure 3).</w:t>
+        <w:t xml:space="preserve">Table 1 summarises the 118 trials (Supplementary Appendix C). The 109 trials that reported sample size enrolled 27,088 participants (median 109, interquartile range 66-228). The number was randomised or enrolled in 73 of these trials (median 125; 19,787 participants), analysed or completed in 6, and its basis could not be identified from the abstract in 30. Healthcare workers were studied in 73 (61.9%) trials, mental-health and social-care professionals in 7, teachers in 16 and employees of other sectors in 22. Of the trials, 76 (64.4%) were first reported from 2023 onwards (Figure 2); the share studying healthcare workers rose from 23.5% before 2020 to 72.0% in 2020-2022 and 67.1% from 2023, and live online group sessions, absent before 2020, were used in 23 trials from 2023. Web programmes (50 trials) and smartphone apps (21) were the commonest delivery modes. Mindfulness was the most frequent psychological approach (24 trials), and all 6 coaching trials were in physicians (Figure 3).</w:t>
       </w:r>
     </w:p>
     <w:p>
@@ -855,7 +855,7 @@
           <w:sz w:val="24"/>
           <w:szCs w:val="24"/>
         </w:rPr>
-        <w:t xml:space="preserve"> Characteristics of the included trials (n = 116)</w:t>
+        <w:t xml:space="preserve"> Characteristics of the included trials (n = 118)</w:t>
       </w:r>
     </w:p>
     <w:tbl>
@@ -1072,7 +1072,7 @@
                 <w:sz w:val="18"/>
                 <w:szCs w:val="18"/>
               </w:rPr>
-              <w:t xml:space="preserve">17 (14.7%)</w:t>
+              <w:t xml:space="preserve">17 (14.4%)</w:t>
             </w:r>
           </w:p>
         </w:tc>
@@ -1138,7 +1138,7 @@
                 <w:sz w:val="18"/>
                 <w:szCs w:val="18"/>
               </w:rPr>
-              <w:t xml:space="preserve">24 (20.7%)</w:t>
+              <w:t xml:space="preserve">25 (21.2%)</w:t>
             </w:r>
           </w:p>
         </w:tc>
@@ -1204,7 +1204,7 @@
                 <w:sz w:val="18"/>
                 <w:szCs w:val="18"/>
               </w:rPr>
-              <w:t xml:space="preserve">75 (64.7%)</w:t>
+              <w:t xml:space="preserve">76 (64.4%)</w:t>
             </w:r>
           </w:p>
         </w:tc>
@@ -1336,7 +1336,7 @@
                 <w:sz w:val="18"/>
                 <w:szCs w:val="18"/>
               </w:rPr>
-              <w:t xml:space="preserve">35 (30.2%)</w:t>
+              <w:t xml:space="preserve">35 (29.7%)</w:t>
             </w:r>
           </w:p>
         </w:tc>
@@ -1402,7 +1402,7 @@
                 <w:sz w:val="18"/>
                 <w:szCs w:val="18"/>
               </w:rPr>
-              <w:t xml:space="preserve">22 (19.0%)</w:t>
+              <w:t xml:space="preserve">22 (18.6%)</w:t>
             </w:r>
           </w:p>
         </w:tc>
@@ -1468,7 +1468,7 @@
                 <w:sz w:val="18"/>
                 <w:szCs w:val="18"/>
               </w:rPr>
-              <w:t xml:space="preserve">15 (12.9%)</w:t>
+              <w:t xml:space="preserve">16 (13.6%)</w:t>
             </w:r>
           </w:p>
         </w:tc>
@@ -1534,7 +1534,7 @@
                 <w:sz w:val="18"/>
                 <w:szCs w:val="18"/>
               </w:rPr>
-              <w:t xml:space="preserve">15 (12.9%)</w:t>
+              <w:t xml:space="preserve">16 (13.6%)</w:t>
             </w:r>
           </w:p>
         </w:tc>
@@ -1600,7 +1600,7 @@
                 <w:sz w:val="18"/>
                 <w:szCs w:val="18"/>
               </w:rPr>
-              <w:t xml:space="preserve">9 (7.8%)</w:t>
+              <w:t xml:space="preserve">9 (7.6%)</w:t>
             </w:r>
           </w:p>
         </w:tc>
@@ -1666,7 +1666,7 @@
                 <w:sz w:val="18"/>
                 <w:szCs w:val="18"/>
               </w:rPr>
-              <w:t xml:space="preserve">8 (6.9%)</w:t>
+              <w:t xml:space="preserve">8 (6.8%)</w:t>
             </w:r>
           </w:p>
         </w:tc>
@@ -1732,7 +1732,7 @@
                 <w:sz w:val="18"/>
                 <w:szCs w:val="18"/>
               </w:rPr>
-              <w:t xml:space="preserve">7 (6.0%)</w:t>
+              <w:t xml:space="preserve">7 (5.9%)</w:t>
             </w:r>
           </w:p>
         </w:tc>
@@ -1798,7 +1798,7 @@
                 <w:sz w:val="18"/>
                 <w:szCs w:val="18"/>
               </w:rPr>
-              <w:t xml:space="preserve">5 (4.3%)</w:t>
+              <w:t xml:space="preserve">5 (4.2%)</w:t>
             </w:r>
           </w:p>
         </w:tc>
@@ -1930,7 +1930,7 @@
                 <w:sz w:val="18"/>
                 <w:szCs w:val="18"/>
               </w:rPr>
-              <w:t xml:space="preserve">49 (42.2%)</w:t>
+              <w:t xml:space="preserve">50 (42.4%)</w:t>
             </w:r>
           </w:p>
         </w:tc>
@@ -1996,7 +1996,7 @@
                 <w:sz w:val="18"/>
                 <w:szCs w:val="18"/>
               </w:rPr>
-              <w:t xml:space="preserve">24 (20.7%)</w:t>
+              <w:t xml:space="preserve">25 (21.2%)</w:t>
             </w:r>
           </w:p>
         </w:tc>
@@ -2062,7 +2062,7 @@
                 <w:sz w:val="18"/>
                 <w:szCs w:val="18"/>
               </w:rPr>
-              <w:t xml:space="preserve">21 (18.1%)</w:t>
+              <w:t xml:space="preserve">21 (17.8%)</w:t>
             </w:r>
           </w:p>
         </w:tc>
@@ -2128,7 +2128,7 @@
                 <w:sz w:val="18"/>
                 <w:szCs w:val="18"/>
               </w:rPr>
-              <w:t xml:space="preserve">9 (7.8%)</w:t>
+              <w:t xml:space="preserve">9 (7.6%)</w:t>
             </w:r>
           </w:p>
         </w:tc>
@@ -2194,7 +2194,7 @@
                 <w:sz w:val="18"/>
                 <w:szCs w:val="18"/>
               </w:rPr>
-              <w:t xml:space="preserve">5 (4.3%)</w:t>
+              <w:t xml:space="preserve">5 (4.2%)</w:t>
             </w:r>
           </w:p>
         </w:tc>
@@ -2326,7 +2326,7 @@
                 <w:sz w:val="18"/>
                 <w:szCs w:val="18"/>
               </w:rPr>
-              <w:t xml:space="preserve">3 (2.6%)</w:t>
+              <w:t xml:space="preserve">3 (2.5%)</w:t>
             </w:r>
           </w:p>
         </w:tc>
@@ -2392,7 +2392,7 @@
                 <w:sz w:val="18"/>
                 <w:szCs w:val="18"/>
               </w:rPr>
-              <w:t xml:space="preserve">1 (0.9%)</w:t>
+              <w:t xml:space="preserve">1 (0.8%)</w:t>
             </w:r>
           </w:p>
         </w:tc>
@@ -2524,7 +2524,7 @@
                 <w:sz w:val="18"/>
                 <w:szCs w:val="18"/>
               </w:rPr>
-              <w:t xml:space="preserve">23 (19.8%)</w:t>
+              <w:t xml:space="preserve">24 (20.3%)</w:t>
             </w:r>
           </w:p>
         </w:tc>
@@ -2590,7 +2590,7 @@
                 <w:sz w:val="18"/>
                 <w:szCs w:val="18"/>
               </w:rPr>
-              <w:t xml:space="preserve">20 (17.2%)</w:t>
+              <w:t xml:space="preserve">21 (17.8%)</w:t>
             </w:r>
           </w:p>
         </w:tc>
@@ -2656,7 +2656,7 @@
                 <w:sz w:val="18"/>
                 <w:szCs w:val="18"/>
               </w:rPr>
-              <w:t xml:space="preserve">13 (11.2%)</w:t>
+              <w:t xml:space="preserve">13 (11.0%)</w:t>
             </w:r>
           </w:p>
         </w:tc>
@@ -2722,7 +2722,7 @@
                 <w:sz w:val="18"/>
                 <w:szCs w:val="18"/>
               </w:rPr>
-              <w:t xml:space="preserve">12 (10.3%)</w:t>
+              <w:t xml:space="preserve">12 (10.2%)</w:t>
             </w:r>
           </w:p>
         </w:tc>
@@ -2788,7 +2788,7 @@
                 <w:sz w:val="18"/>
                 <w:szCs w:val="18"/>
               </w:rPr>
-              <w:t xml:space="preserve">9 (7.8%)</w:t>
+              <w:t xml:space="preserve">9 (7.6%)</w:t>
             </w:r>
           </w:p>
         </w:tc>
@@ -2854,7 +2854,7 @@
                 <w:sz w:val="18"/>
                 <w:szCs w:val="18"/>
               </w:rPr>
-              <w:t xml:space="preserve">7 (6.0%)</w:t>
+              <w:t xml:space="preserve">7 (5.9%)</w:t>
             </w:r>
           </w:p>
         </w:tc>
@@ -2920,7 +2920,7 @@
                 <w:sz w:val="18"/>
                 <w:szCs w:val="18"/>
               </w:rPr>
-              <w:t xml:space="preserve">6 (5.2%)</w:t>
+              <w:t xml:space="preserve">6 (5.1%)</w:t>
             </w:r>
           </w:p>
         </w:tc>
@@ -2986,7 +2986,7 @@
                 <w:sz w:val="18"/>
                 <w:szCs w:val="18"/>
               </w:rPr>
-              <w:t xml:space="preserve">6 (5.2%)</w:t>
+              <w:t xml:space="preserve">6 (5.1%)</w:t>
             </w:r>
           </w:p>
         </w:tc>
@@ -3052,7 +3052,7 @@
                 <w:sz w:val="18"/>
                 <w:szCs w:val="18"/>
               </w:rPr>
-              <w:t xml:space="preserve">6 (5.2%)</w:t>
+              <w:t xml:space="preserve">6 (5.1%)</w:t>
             </w:r>
           </w:p>
         </w:tc>
@@ -3118,7 +3118,7 @@
                 <w:sz w:val="18"/>
                 <w:szCs w:val="18"/>
               </w:rPr>
-              <w:t xml:space="preserve">5 (4.3%)</w:t>
+              <w:t xml:space="preserve">5 (4.2%)</w:t>
             </w:r>
           </w:p>
         </w:tc>
@@ -3316,7 +3316,7 @@
                 <w:sz w:val="18"/>
                 <w:szCs w:val="18"/>
               </w:rPr>
-              <w:t xml:space="preserve">1 (0.9%)</w:t>
+              <w:t xml:space="preserve">1 (0.8%)</w:t>
             </w:r>
           </w:p>
         </w:tc>
@@ -3448,7 +3448,7 @@
                 <w:sz w:val="18"/>
                 <w:szCs w:val="18"/>
               </w:rPr>
-              <w:t xml:space="preserve">96 (82.8%)</w:t>
+              <w:t xml:space="preserve">97 (82.2%)</w:t>
             </w:r>
           </w:p>
         </w:tc>
@@ -3514,7 +3514,7 @@
                 <w:sz w:val="18"/>
                 <w:szCs w:val="18"/>
               </w:rPr>
-              <w:t xml:space="preserve">8 (6.9%)</w:t>
+              <w:t xml:space="preserve">9 (7.6%)</w:t>
             </w:r>
           </w:p>
         </w:tc>
@@ -3580,7 +3580,7 @@
                 <w:sz w:val="18"/>
                 <w:szCs w:val="18"/>
               </w:rPr>
-              <w:t xml:space="preserve">6 (5.2%)</w:t>
+              <w:t xml:space="preserve">6 (5.1%)</w:t>
             </w:r>
           </w:p>
         </w:tc>
@@ -3646,7 +3646,7 @@
                 <w:sz w:val="18"/>
                 <w:szCs w:val="18"/>
               </w:rPr>
-              <w:t xml:space="preserve">3 (2.6%)</w:t>
+              <w:t xml:space="preserve">3 (2.5%)</w:t>
             </w:r>
           </w:p>
         </w:tc>
@@ -3712,7 +3712,7 @@
                 <w:sz w:val="18"/>
                 <w:szCs w:val="18"/>
               </w:rPr>
-              <w:t xml:space="preserve">3 (2.6%)</w:t>
+              <w:t xml:space="preserve">3 (2.5%)</w:t>
             </w:r>
           </w:p>
         </w:tc>
@@ -3844,7 +3844,7 @@
                 <w:sz w:val="18"/>
                 <w:szCs w:val="18"/>
               </w:rPr>
-              <w:t xml:space="preserve">38 (32.8%)</w:t>
+              <w:t xml:space="preserve">39 (33.1%)</w:t>
             </w:r>
           </w:p>
         </w:tc>
@@ -3910,7 +3910,7 @@
                 <w:sz w:val="18"/>
                 <w:szCs w:val="18"/>
               </w:rPr>
-              <w:t xml:space="preserve">31 (26.7%)</w:t>
+              <w:t xml:space="preserve">32 (27.1%)</w:t>
             </w:r>
           </w:p>
         </w:tc>
@@ -3976,7 +3976,7 @@
                 <w:sz w:val="18"/>
                 <w:szCs w:val="18"/>
               </w:rPr>
-              <w:t xml:space="preserve">27 (23.3%)</w:t>
+              <w:t xml:space="preserve">27 (22.9%)</w:t>
             </w:r>
           </w:p>
         </w:tc>
@@ -4042,7 +4042,7 @@
                 <w:sz w:val="18"/>
                 <w:szCs w:val="18"/>
               </w:rPr>
-              <w:t xml:space="preserve">12 (10.3%)</w:t>
+              <w:t xml:space="preserve">12 (10.2%)</w:t>
             </w:r>
           </w:p>
         </w:tc>
@@ -4108,7 +4108,7 @@
                 <w:sz w:val="18"/>
                 <w:szCs w:val="18"/>
               </w:rPr>
-              <w:t xml:space="preserve">8 (6.9%)</w:t>
+              <w:t xml:space="preserve">8 (6.8%)</w:t>
             </w:r>
           </w:p>
         </w:tc>
@@ -4240,7 +4240,7 @@
                 <w:sz w:val="18"/>
                 <w:szCs w:val="18"/>
               </w:rPr>
-              <w:t xml:space="preserve">49 (42.2%)</w:t>
+              <w:t xml:space="preserve">50 (42.4%)</w:t>
             </w:r>
           </w:p>
         </w:tc>
@@ -4306,7 +4306,7 @@
                 <w:sz w:val="18"/>
                 <w:szCs w:val="18"/>
               </w:rPr>
-              <w:t xml:space="preserve">49 (42.2%)</w:t>
+              <w:t xml:space="preserve">50 (42.4%)</w:t>
             </w:r>
           </w:p>
         </w:tc>
@@ -4372,7 +4372,7 @@
                 <w:sz w:val="18"/>
                 <w:szCs w:val="18"/>
               </w:rPr>
-              <w:t xml:space="preserve">18 (15.5%)</w:t>
+              <w:t xml:space="preserve">18 (15.3%)</w:t>
             </w:r>
           </w:p>
         </w:tc>
@@ -4504,7 +4504,7 @@
                 <w:sz w:val="18"/>
                 <w:szCs w:val="18"/>
               </w:rPr>
-              <w:t xml:space="preserve">62 (53.4%)</w:t>
+              <w:t xml:space="preserve">63 (53.4%)</w:t>
             </w:r>
           </w:p>
         </w:tc>
@@ -4570,7 +4570,7 @@
                 <w:sz w:val="18"/>
                 <w:szCs w:val="18"/>
               </w:rPr>
-              <w:t xml:space="preserve">13 (11.2%)</w:t>
+              <w:t xml:space="preserve">13 (11.0%)</w:t>
             </w:r>
           </w:p>
         </w:tc>
@@ -4636,7 +4636,7 @@
                 <w:sz w:val="18"/>
                 <w:szCs w:val="18"/>
               </w:rPr>
-              <w:t xml:space="preserve">10 (8.6%)</w:t>
+              <w:t xml:space="preserve">10 (8.5%)</w:t>
             </w:r>
           </w:p>
         </w:tc>
@@ -4702,7 +4702,7 @@
                 <w:sz w:val="18"/>
                 <w:szCs w:val="18"/>
               </w:rPr>
-              <w:t xml:space="preserve">7 (6.0%)</w:t>
+              <w:t xml:space="preserve">7 (5.9%)</w:t>
             </w:r>
           </w:p>
         </w:tc>
@@ -4768,7 +4768,7 @@
                 <w:sz w:val="18"/>
                 <w:szCs w:val="18"/>
               </w:rPr>
-              <w:t xml:space="preserve">6 (5.2%)</w:t>
+              <w:t xml:space="preserve">6 (5.1%)</w:t>
             </w:r>
           </w:p>
         </w:tc>
@@ -4834,7 +4834,7 @@
                 <w:sz w:val="18"/>
                 <w:szCs w:val="18"/>
               </w:rPr>
-              <w:t xml:space="preserve">5 (4.3%)</w:t>
+              <w:t xml:space="preserve">5 (4.2%)</w:t>
             </w:r>
           </w:p>
         </w:tc>
@@ -5032,7 +5032,7 @@
                 <w:sz w:val="18"/>
                 <w:szCs w:val="18"/>
               </w:rPr>
-              <w:t xml:space="preserve">1 (0.9%)</w:t>
+              <w:t xml:space="preserve">1 (0.8%)</w:t>
             </w:r>
           </w:p>
         </w:tc>
@@ -5098,7 +5098,7 @@
                 <w:sz w:val="18"/>
                 <w:szCs w:val="18"/>
               </w:rPr>
-              <w:t xml:space="preserve">1 (0.9%)</w:t>
+              <w:t xml:space="preserve">1 (0.8%)</w:t>
             </w:r>
           </w:p>
         </w:tc>
@@ -5164,7 +5164,7 @@
                 <w:sz w:val="18"/>
                 <w:szCs w:val="18"/>
               </w:rPr>
-              <w:t xml:space="preserve">1 (0.9%)</w:t>
+              <w:t xml:space="preserve">1 (0.8%)</w:t>
             </w:r>
           </w:p>
         </w:tc>
@@ -5230,7 +5230,7 @@
                 <w:sz w:val="18"/>
                 <w:szCs w:val="18"/>
               </w:rPr>
-              <w:t xml:space="preserve">1 (0.9%)</w:t>
+              <w:t xml:space="preserve">1 (0.8%)</w:t>
             </w:r>
           </w:p>
         </w:tc>
@@ -5296,7 +5296,7 @@
                 <w:sz w:val="18"/>
                 <w:szCs w:val="18"/>
               </w:rPr>
-              <w:t xml:space="preserve">1 (0.9%)</w:t>
+              <w:t xml:space="preserve">1 (0.8%)</w:t>
             </w:r>
           </w:p>
         </w:tc>
@@ -5362,7 +5362,7 @@
                 <w:sz w:val="18"/>
                 <w:szCs w:val="18"/>
               </w:rPr>
-              <w:t xml:space="preserve">1 (0.9%)</w:t>
+              <w:t xml:space="preserve">1 (0.8%)</w:t>
             </w:r>
           </w:p>
         </w:tc>
@@ -5428,7 +5428,7 @@
                 <w:sz w:val="18"/>
                 <w:szCs w:val="18"/>
               </w:rPr>
-              <w:t xml:space="preserve">3 (2.6%)</w:t>
+              <w:t xml:space="preserve">4 (3.4%)</w:t>
             </w:r>
           </w:p>
         </w:tc>
@@ -5527,7 +5527,7 @@
           <w:sz w:val="24"/>
           <w:szCs w:val="24"/>
         </w:rPr>
-        <w:t xml:space="preserve"> Included trials by year of first report and main delivery mode (n = 116). Data for 2026 cover 1 January to 18 October 2026.</w:t>
+        <w:t xml:space="preserve"> Included trials by year of first report and main delivery mode (n = 118). Data for 2026 cover 1 January to 18 October 2026.</w:t>
       </w:r>
     </w:p>
     <w:p>
@@ -5597,7 +5597,7 @@
           <w:sz w:val="24"/>
           <w:szCs w:val="24"/>
         </w:rPr>
-        <w:t xml:space="preserve"> Evidence map: trials by occupational group and intervention approach (n = 116); totals in parentheses, dots mark empty cells.</w:t>
+        <w:t xml:space="preserve"> Evidence map: trials by occupational group and intervention approach (n = 118); totals in parentheses, dots mark empty cells.</w:t>
       </w:r>
     </w:p>
     <w:p>
@@ -5629,7 +5629,7 @@
           <w:sz w:val="24"/>
           <w:szCs w:val="24"/>
         </w:rPr>
-        <w:t xml:space="preserve">A mechanism that was not psychological was tested in 20 trials (17.2%): professional training (8), physical activity or health behaviour (6), feedback or navigation (3) and workflow automation (3, all ambient AI scribes for physicians). Of these, 11 were found only by the searches added after the main search. A waitlist or delayed-access comparator was used in 38 (32.8%) trials, an active or attention control in 31 (26.7%) and usual practice in 27 (23.3%); waitlists rose from 19.5% of trials before 2023 to 40.0% from 2023 (Table 2). Self-guided or automated interventions (49) and human-supported interventions (49) were equally common; support depended on delivery mode (23 of 24 live programmes were facilitated, 20 of 21 apps self-guided).</w:t>
+        <w:t xml:space="preserve">A mechanism that was not psychological was tested in 21 trials (17.8%): professional training (9), physical activity or health behaviour (6), feedback or navigation (3) and workflow automation (3, all ambient AI scribes for physicians). Of these, 12 were found only by the searches added after the main search. A waitlist or delayed-access comparator was used in 39 (33.1%) trials, an active or attention control in 32 (27.1%) and usual practice in 27 (22.9%); waitlists rose from 19.0% of trials before 2023 to 40.8% from 2023 (Table 2). Self-guided or automated interventions (50) and human-supported interventions (50) were equally common; support depended on delivery mode (24 of 25 live programmes were facilitated, 20 of 21 apps self-guided).</w:t>
       </w:r>
     </w:p>
     <w:p>
@@ -5938,7 +5938,7 @@
                 <w:sz w:val="18"/>
                 <w:szCs w:val="18"/>
               </w:rPr>
-              <w:t xml:space="preserve">24</w:t>
+              <w:t xml:space="preserve">25</w:t>
             </w:r>
           </w:p>
         </w:tc>
@@ -5970,7 +5970,7 @@
                 <w:sz w:val="18"/>
                 <w:szCs w:val="18"/>
               </w:rPr>
-              <w:t xml:space="preserve">75</w:t>
+              <w:t xml:space="preserve">76</w:t>
             </w:r>
           </w:p>
         </w:tc>
@@ -6002,7 +6002,7 @@
                 <w:sz w:val="18"/>
                 <w:szCs w:val="18"/>
               </w:rPr>
-              <w:t xml:space="preserve">116</w:t>
+              <w:t xml:space="preserve">118</w:t>
             </w:r>
           </w:p>
         </w:tc>
@@ -6100,7 +6100,7 @@
                 <w:sz w:val="18"/>
                 <w:szCs w:val="18"/>
               </w:rPr>
-              <w:t xml:space="preserve">101</w:t>
+              <w:t xml:space="preserve">90.5</w:t>
             </w:r>
           </w:p>
         </w:tc>
@@ -6132,7 +6132,7 @@
                 <w:sz w:val="18"/>
                 <w:szCs w:val="18"/>
               </w:rPr>
-              <w:t xml:space="preserve">119.5</w:t>
+              <w:t xml:space="preserve">119</w:t>
             </w:r>
           </w:p>
         </w:tc>
@@ -6164,7 +6164,7 @@
                 <w:sz w:val="18"/>
                 <w:szCs w:val="18"/>
               </w:rPr>
-              <w:t xml:space="preserve">111</w:t>
+              <w:t xml:space="preserve">109</w:t>
             </w:r>
           </w:p>
         </w:tc>
@@ -6262,7 +6262,7 @@
                 <w:sz w:val="18"/>
                 <w:szCs w:val="18"/>
               </w:rPr>
-              <w:t xml:space="preserve">70.8</w:t>
+              <w:t xml:space="preserve">72.0</w:t>
             </w:r>
           </w:p>
         </w:tc>
@@ -6294,7 +6294,7 @@
                 <w:sz w:val="18"/>
                 <w:szCs w:val="18"/>
               </w:rPr>
-              <w:t xml:space="preserve">68.0</w:t>
+              <w:t xml:space="preserve">67.1</w:t>
             </w:r>
           </w:p>
         </w:tc>
@@ -6326,7 +6326,7 @@
                 <w:sz w:val="18"/>
                 <w:szCs w:val="18"/>
               </w:rPr>
-              <w:t xml:space="preserve">62.1</w:t>
+              <w:t xml:space="preserve">61.9</w:t>
             </w:r>
           </w:p>
         </w:tc>
@@ -6424,7 +6424,7 @@
                 <w:sz w:val="18"/>
                 <w:szCs w:val="18"/>
               </w:rPr>
-              <w:t xml:space="preserve">12.5</w:t>
+              <w:t xml:space="preserve">12.0</w:t>
             </w:r>
           </w:p>
         </w:tc>
@@ -6456,7 +6456,7 @@
                 <w:sz w:val="18"/>
                 <w:szCs w:val="18"/>
               </w:rPr>
-              <w:t xml:space="preserve">40.0</w:t>
+              <w:t xml:space="preserve">40.8</w:t>
             </w:r>
           </w:p>
         </w:tc>
@@ -6488,7 +6488,7 @@
                 <w:sz w:val="18"/>
                 <w:szCs w:val="18"/>
               </w:rPr>
-              <w:t xml:space="preserve">32.8</w:t>
+              <w:t xml:space="preserve">33.1</w:t>
             </w:r>
           </w:p>
         </w:tc>
@@ -6586,7 +6586,7 @@
                 <w:sz w:val="18"/>
                 <w:szCs w:val="18"/>
               </w:rPr>
-              <w:t xml:space="preserve">33.3</w:t>
+              <w:t xml:space="preserve">36.0</w:t>
             </w:r>
           </w:p>
         </w:tc>
@@ -6618,7 +6618,7 @@
                 <w:sz w:val="18"/>
                 <w:szCs w:val="18"/>
               </w:rPr>
-              <w:t xml:space="preserve">22.7</w:t>
+              <w:t xml:space="preserve">22.4</w:t>
             </w:r>
           </w:p>
         </w:tc>
@@ -6650,7 +6650,7 @@
                 <w:sz w:val="18"/>
                 <w:szCs w:val="18"/>
               </w:rPr>
-              <w:t xml:space="preserve">26.7</w:t>
+              <w:t xml:space="preserve">27.1</w:t>
             </w:r>
           </w:p>
         </w:tc>
@@ -6748,7 +6748,7 @@
                 <w:sz w:val="18"/>
                 <w:szCs w:val="18"/>
               </w:rPr>
-              <w:t xml:space="preserve">33.3</w:t>
+              <w:t xml:space="preserve">32.0</w:t>
             </w:r>
           </w:p>
         </w:tc>
@@ -6780,7 +6780,7 @@
                 <w:sz w:val="18"/>
                 <w:szCs w:val="18"/>
               </w:rPr>
-              <w:t xml:space="preserve">45.3</w:t>
+              <w:t xml:space="preserve">46.1</w:t>
             </w:r>
           </w:p>
         </w:tc>
@@ -6812,7 +6812,7 @@
                 <w:sz w:val="18"/>
                 <w:szCs w:val="18"/>
               </w:rPr>
-              <w:t xml:space="preserve">42.2</w:t>
+              <w:t xml:space="preserve">42.4</w:t>
             </w:r>
           </w:p>
         </w:tc>
@@ -6910,7 +6910,7 @@
                 <w:sz w:val="18"/>
                 <w:szCs w:val="18"/>
               </w:rPr>
-              <w:t xml:space="preserve">16.7</w:t>
+              <w:t xml:space="preserve">16.0</w:t>
             </w:r>
           </w:p>
         </w:tc>
@@ -6942,7 +6942,7 @@
                 <w:sz w:val="18"/>
                 <w:szCs w:val="18"/>
               </w:rPr>
-              <w:t xml:space="preserve">16.0</w:t>
+              <w:t xml:space="preserve">17.1</w:t>
             </w:r>
           </w:p>
         </w:tc>
@@ -6974,7 +6974,7 @@
                 <w:sz w:val="18"/>
                 <w:szCs w:val="18"/>
               </w:rPr>
-              <w:t xml:space="preserve">17.2</w:t>
+              <w:t xml:space="preserve">17.8</w:t>
             </w:r>
           </w:p>
         </w:tc>
@@ -7072,7 +7072,7 @@
                 <w:sz w:val="18"/>
                 <w:szCs w:val="18"/>
               </w:rPr>
-              <w:t xml:space="preserve">50.0</w:t>
+              <w:t xml:space="preserve">48.0</w:t>
             </w:r>
           </w:p>
         </w:tc>
@@ -7104,7 +7104,7 @@
                 <w:sz w:val="18"/>
                 <w:szCs w:val="18"/>
               </w:rPr>
-              <w:t xml:space="preserve">56.0</w:t>
+              <w:t xml:space="preserve">55.3</w:t>
             </w:r>
           </w:p>
         </w:tc>
@@ -7136,7 +7136,7 @@
                 <w:sz w:val="18"/>
                 <w:szCs w:val="18"/>
               </w:rPr>
-              <w:t xml:space="preserve">50.0</w:t>
+              <w:t xml:space="preserve">49.2</w:t>
             </w:r>
           </w:p>
         </w:tc>
@@ -7233,7 +7233,7 @@
           <w:sz w:val="24"/>
           <w:szCs w:val="24"/>
         </w:rPr>
-        <w:t xml:space="preserve">The burnout instrument was named in 58 (50.0%) abstracts; the full text identified it for 55 of the other 58, and 3 remained undetermined. The Maslach Burnout Inventory or an adaptation was used in 62 (53.4%) trials, followed by the Copenhagen (13) and Oldenburg (10) inventories. In the abstracts, a registration number was given in 31 (26.7%) trials, attrition or analysed numbers in 31 (26.7%), an analysis population in 17 (14.7%), blinding in 13 (11.2%) and a randomisation method in 7 (6.0%). The abstract reported a burnout result favouring the intervention in 49 (42.2%) trials, a mixed result (one subscale, subgroup, arm or time point) in 27 (23.3%), no difference in 20 (17.2%) and an unfavourable result in 2 (1.7%); 4 (3.4%) reported improvement in all arms and 14 (12.1%) stated no burnout result. These codes describe reporting and are not effect estimates (Supplementary Table S3). On the verification sample the reviewers' direction codes agreed for 17 of 23 trials (74%; kappa 0.62) and the indicator judgements for 110 of 115 (96%).</w:t>
+        <w:t xml:space="preserve">The burnout instrument was named in 58 (49.2%) abstracts; the full text identified it for 56 of the other 60, and 4 remained undetermined. The Maslach Burnout Inventory or an adaptation was used in 63 (53.4%) trials, followed by the Copenhagen (13) and Oldenburg (10) inventories. In the abstracts, a registration number was given in 31 (26.3%) trials, attrition or analysed numbers in 32 (27.1%), an analysis population in 17 (14.4%), blinding in 13 (11.0%) and a randomisation method in 7 (5.9%). The abstract reported a burnout result favouring the intervention in 50 (42.4%) trials, a mixed result (one subscale, subgroup, arm or time point) in 27 (22.9%), no difference in 20 (16.9%) and an unfavourable result in 2 (1.7%); 4 (3.4%) reported improvement in all arms and 15 (12.7%) stated no burnout result. These codes describe reporting and are not effect estimates (Supplementary Table S3). On the verification sample the reviewers' direction codes agreed for 17 of 23 trials (74%; kappa 0.62) and the indicator judgements for 110 of 115 (96%).</w:t>
       </w:r>
     </w:p>
     <w:p>
@@ -7265,7 +7265,7 @@
           <w:sz w:val="24"/>
           <w:szCs w:val="24"/>
         </w:rPr>
-        <w:t xml:space="preserve">Of the 28 completed registrations, 19 were randomised and 15 of these had been completed by the end of 2023. A results report was included in this review for 7, results of 2 had been published outside its scope, and for 6 (40.0%) no results report was located (Supplementary Table S4).</w:t>
+        <w:t xml:space="preserve">Of the 28 completed registrations, 19 were randomised and 15 of these had been completed by the end of 2023. A results report was included in this review for 9, results of 2 had been published outside its scope, and for 4 (26.7%) no results report was located (Supplementary Table S4).</w:t>
       </w:r>
     </w:p>
     <w:p>
@@ -7313,7 +7313,7 @@
           <w:sz w:val="24"/>
           <w:szCs w:val="24"/>
         </w:rPr>
-        <w:t xml:space="preserve">This review identified 116 randomised trials of digitally delivered interventions that reported burnout in working populations. The evidence is recent: 64.7% of the trials were first reported from 2023 onwards, and the field changed after 2020 in who was studied and how interventions were delivered. It is concentrated in healthcare (62.1%), while teachers and employees of other sectors together contribute 31.9%. Most trials test psychological programmes that ask the individual worker to change (82.8%), whereas interventions that change training, work processes or practical conditions are a small and partly hidden part of the literature: 11 of 20 were found only by the searches without an intervention block. Design and reporting leave room for improvement: waitlist controls are common and were used in 40.0% of the most recent trials, the typical trial is small, only about half of the abstracts (50.0%) name the burnout instrument, and no results could be found for 6 of 15 registered trials completed by 2023. The rise in trials since 2020 describes the studies identified and published, not the number of trials started, and the concentration of recent trials in hospital staff is compatible with, but does not show, an effect of the pandemic.</w:t>
+        <w:t xml:space="preserve">This review identified 118 randomised trials of digitally delivered interventions that reported burnout in working populations. The evidence is recent: 64.4% of the trials were first reported from 2023 onwards, and the field changed after 2020 in who was studied and how interventions were delivered. It is concentrated in healthcare (61.9%), while teachers and employees of other sectors together contribute 32.2%. Most trials test psychological programmes that ask the individual worker to change (82.2%), whereas interventions that change training, work processes or practical conditions are a small and partly hidden part of the literature: 12 of 21 were found only by the searches without an intervention block. Design and reporting leave room for improvement: waitlist controls are common and were used in 40.8% of the most recent trials, the typical trial is small, only about half of the abstracts (49.2%) name the burnout instrument, and no results could be found for 4 of 15 registered trials completed by 2023. The rise since 2020 describes published trials, not trials started, and is compatible with, but does not show, an effect of the pandemic.</w:t>
       </w:r>
     </w:p>
     <w:p>
@@ -7396,7 +7396,7 @@
           <w:sz w:val="24"/>
           <w:szCs w:val="24"/>
         </w:rPr>
-        <w:t xml:space="preserve"> By restricting design to randomised trials and outcome to burnout while admitting any occupation and mechanism, this review complements them (Supplementary Table S5). Its wider scope shows that the healthcare focus of earlier reviews largely reflects where the trials have been done.</w:t>
+        <w:t xml:space="preserve"> By restricting design to randomised trials and outcome to burnout while admitting any occupation and mechanism, this review complements them (Supplementary Table S5).</w:t>
       </w:r>
     </w:p>
     <w:p>
@@ -7545,7 +7545,7 @@
           <w:sz w:val="24"/>
           <w:szCs w:val="24"/>
         </w:rPr>
-        <w:t xml:space="preserve">Strengths are the search across six databases and a registry with repeated gap checks, a ledger that records every decision with its reason, trial-level analysis and public data. The main limitation is the search. The first strategy was narrower than the eligibility criteria; we corrected this with later searches, each of which found trials the previous one had missed, and the final unified strategy was run in only three sources, so more eligible trials probably remain, particularly in Web of Science, Scopus and the databases we did not search (PsycINFO, Embase, the Cochrane register). Second, selection and charting were done first by an AI assistant and checked by one human reviewer on samples (30 reports and 23 trials), not on every record or variable, and the kappa values from these samples are imprecise. Third, eligibility and charting relied on abstracts, so the comparator, delivery mode and sample size may be incomplete, and the reporting indicators and direction codes describe abstracts only. Fourth, the protocol was not registered in advance. Finally, each trial received one category per variable, which simplifies multicomponent interventions, and the data for 2026 are incomplete. The map describes the evidence identified by these searches and is not a complete census of trials.</w:t>
+        <w:t xml:space="preserve">Strengths are the search across six databases and a registry with repeated gap checks, a ledger that records every decision with its reason, trial-level analysis and public data. The main limitation is the search. The first strategy was narrower than the eligibility criteria; we corrected this with later searches, each of which found trials the previous one had missed, and the final unified strategy was run in only four sources, so more eligible trials probably remain, particularly in Web of Science, Scopus and the databases we did not search (PsycINFO, Embase, the Cochrane register). Second, selection and charting were done first by an AI assistant and checked by one human reviewer on samples (30 reports and 23 trials), not on every record or variable, and the kappa values from these samples are imprecise. Third, eligibility and charting relied on abstracts, so the comparator, delivery mode and sample size may be incomplete, trials that measured burnout only as a secondary outcome reported in the full text can be missed (one was found through the registry), and the reporting indicators and direction codes describe abstracts only. Fourth, the protocol was not registered in advance. Finally, each trial received one category per variable, which simplifies multicomponent interventions, and the data for 2026 are incomplete. The map describes the evidence identified by these searches and is not a complete census of trials.</w:t>
       </w:r>
     </w:p>
     <w:p>
@@ -7575,7 +7575,7 @@
           <w:sz w:val="24"/>
           <w:szCs w:val="24"/>
         </w:rPr>
-        <w:t xml:space="preserve">Randomised evidence on digital interventions for occupational burnout has grown quickly since 2020 and now comprises 116 trials, concentrated in healthcare and in psychological programmes for individual workers. Recent trials rely more often on waitlist controls, many are small pilots, and abstracts often omit the burnout instrument and basic trial features. Future trials should include workers outside healthcare, test interventions that change training and work processes, use active or usual-practice comparators, and report the instrument and the results of every completed trial.</w:t>
+        <w:t xml:space="preserve">Randomised evidence on digital interventions for occupational burnout has grown quickly since 2020 and now comprises 118 trials, concentrated in healthcare and in psychological programmes for individual workers. Recent trials rely more often on waitlist controls, many are small pilots, and abstracts often omit the burnout instrument and basic trial features. Future trials should include workers outside healthcare, test interventions that change training and work processes, use active or usual-practice comparators, and report the instrument and the results of every completed trial.</w:t>
       </w:r>
     </w:p>
     <w:p>
@@ -8075,7 +8075,7 @@
           <w:sz w:val="22"/>
           <w:szCs w:val="22"/>
         </w:rPr>
-        <w:t xml:space="preserve">. 2026. doi:10.1016/j.invent.2026.100909</w:t>
+        <w:t xml:space="preserve">. 2026;43:100909. doi:10.1016/j.invent.2026.100909</w:t>
       </w:r>
     </w:p>
     <w:p>
@@ -8115,7 +8115,7 @@
           <w:sz w:val="22"/>
           <w:szCs w:val="22"/>
         </w:rPr>
-        <w:t xml:space="preserve">. 2020;7(7):CD012527. doi:10.1002/14651858.CD012527.pub2</w:t>
+        <w:t xml:space="preserve">. 2020;(7):CD012527. doi:10.1002/14651858.CD012527.pub2</w:t>
       </w:r>
     </w:p>
     <w:p>

</xml_diff>

<commit_message>
Full-text recheck of burnout-criterion exclusions (15 read, none qualified; R119 reclassified to POP); registry conference abstract noted; 294->301 fixes
Co-Authored-By: Claude Sonnet 5.5 <noreply@anthropic.com>
Claude-Session: https://claude.ai/code/session_01WHdoH2brsuf2zg1uU5YHyB
</commit_message>
<xml_diff>
--- a/paper/manuscript_blinded.docx
+++ b/paper/manuscript_blinded.docx
@@ -568,7 +568,7 @@
           <w:sz w:val="24"/>
           <w:szCs w:val="24"/>
         </w:rPr>
-        <w:t xml:space="preserve">Records were de-duplicated and screened with a rule-based classifier that could only exclude records. The first reviewer was an AI assistant (Section 2.7), which read every remaining record and proposed decisions; the corresponding author decided borderline reports. Eligibility was assessed from titles and abstracts; the full text was consulted for 16 reports in which the abstract was ambiguous or discrepant or the human reviewer disagreed. We estimated the screening error from a random sample of 45 excluded records.</w:t>
+        <w:t xml:space="preserve">Records were de-duplicated and screened with a rule-based classifier that could only exclude records. The first reviewer was an AI assistant (Section 2.7), which read every remaining record and proposed decisions; the corresponding author decided borderline reports. Eligibility was assessed from titles and abstracts; the full text was consulted for 31 reports in which the abstract was ambiguous or discrepant or the human reviewer disagreed. We estimated the screening error from a random sample of 45 excluded records.</w:t>
       </w:r>
       <w:r>
         <w:rPr>
@@ -729,7 +729,7 @@
           <w:sz w:val="24"/>
           <w:szCs w:val="24"/>
         </w:rPr>
-        <w:t xml:space="preserve">The searches identified 4,991 records; 2,510 duplicates and non-article records were removed and 2,481 records were screened. Of 279 reports assessed from the databases, 160 were excluded (26 were not primary reports, 22 were not randomised, 40 did not study workers, 33 were not digitally delivered, 39 did not report burnout as an outcome); 119 were included, and the registry added 2 (Figure 1). In total, 121 reports of 118 trials were included. The searches added after the main search found 31 of the 118 trials (26.3%), 12 of them with non-psychological mechanisms, among them the ambient AI scribe trials. The random sample of 45 excluded records contained no eligible report (0 of 45; exact 95% confidence interval 0% to 7.9%). In the blind comparison of 30 reports the reviewers agreed on 24 (80%; kappa 0.60, 95% confidence interval 0.31 to 0.89); if the two partly digital interventions were counted as excluded, agreement was 73% (kappa 0.47).</w:t>
+        <w:t xml:space="preserve">The searches identified 4,991 records; 2,510 duplicates and non-article records were removed and 2,481 records were screened. Of 279 reports assessed from the databases, 160 were excluded (26 were not primary reports, 22 were not randomised, 41 did not study workers, 33 were not digitally delivered, 38 did not report burnout as an outcome); 119 were included, and the registry added 2 (Figure 1). In total, 121 reports of 118 trials were included. The searches added after the main search found 31 of the 118 trials (26.3%), 12 of them with non-psychological mechanisms, among them the ambient AI scribe trials. The random sample of 45 excluded records contained no eligible report (0 of 45; exact 95% confidence interval 0% to 7.9%). In the blind comparison of 30 reports the reviewers agreed on 24 (80%; kappa 0.60, 95% confidence interval 0.31 to 0.89); if the two partly digital interventions were counted as excluded, agreement was 73% (kappa 0.47).</w:t>
       </w:r>
     </w:p>
     <w:p>
@@ -7545,7 +7545,7 @@
           <w:sz w:val="24"/>
           <w:szCs w:val="24"/>
         </w:rPr>
-        <w:t xml:space="preserve">Strengths are the search across six databases and a registry with repeated gap checks, a ledger that records every decision with its reason, trial-level analysis and public data. The main limitation is the search. The first strategy was narrower than the eligibility criteria; we corrected this with later searches, each of which found trials the previous one had missed, and the final unified strategy was run in only four sources, so more eligible trials probably remain, particularly in Web of Science, Scopus and the databases we did not search (PsycINFO, Embase, the Cochrane register). Second, selection and charting were done first by an AI assistant and checked by one human reviewer on samples (30 reports and 23 trials), not on every record or variable, and the kappa values from these samples are imprecise. Third, eligibility and charting relied on abstracts, so the comparator, delivery mode and sample size may be incomplete, trials that measured burnout only as a secondary outcome reported in the full text can be missed (one was found through the registry), and the reporting indicators and direction codes describe abstracts only. Fourth, the protocol was not registered in advance. Finally, each trial received one category per variable, which simplifies multicomponent interventions, and the data for 2026 are incomplete. The map describes the evidence identified by these searches and is not a complete census of trials.</w:t>
+        <w:t xml:space="preserve">Strengths are the search across six databases and a registry with repeated gap checks, a ledger that records every decision with its reason, trial-level analysis and public data. The main limitation is the search. The first strategy was narrower than the eligibility criteria; we corrected this with later searches, each of which found trials the previous one had missed, and the final unified strategy was run in only four sources, so more eligible trials probably remain, particularly in Web of Science, Scopus and the databases we did not search (PsycINFO, Embase, the Cochrane register). Second, selection and charting were done first by an AI assistant and checked by one human reviewer on samples (30 reports and 23 trials), not on every record or variable, and the kappa values from these samples are imprecise. Third, eligibility and charting relied on abstracts, so the comparator, delivery mode and sample size may be incomplete, trials that measured burnout only as a secondary outcome reported in the full text can be missed (one was found through the registry; of the 37 reports excluded on abstracts for lack of a burnout outcome, we read the open-access full text of 15 and none qualified, but 22 could not be accessed), and the reporting indicators and direction codes describe abstracts only. Fourth, the protocol was not registered in advance. Finally, each trial received one category per variable, which simplifies multicomponent interventions, and the data for 2026 are incomplete. The map describes the evidence identified by these searches and is not a complete census of trials.</w:t>
       </w:r>
     </w:p>
     <w:p>
@@ -7687,7 +7687,7 @@
           <w:sz w:val="24"/>
           <w:szCs w:val="24"/>
         </w:rPr>
-        <w:t xml:space="preserve"> The ledger of all 294 assessed reports, the trial-level charting, the screening files, the abstract-coding files with the verification sample, the code and a data dictionary are in a public repository (link in the title page file, withheld here for blinded review). Abstracts retrieved from Web of Science and Scopus and full-text articles are not redistributed.</w:t>
+        <w:t xml:space="preserve"> The ledger of all 301 assessed reports, the trial-level charting, the screening files, the abstract-coding files with the verification sample, the code and a data dictionary are in a public repository (link in the title page file, withheld here for blinded review). Abstracts retrieved from Web of Science and Scopus and full-text articles are not redistributed.</w:t>
       </w:r>
     </w:p>
     <w:p>

</xml_diff>

<commit_message>
Author-supplied full texts: S122 instrument = MBI emotional exhaustion; S119 excluded (burnout was an inclusion condition, not an outcome); 117 trials in 120 reports
Co-Authored-By: Claude Sonnet 5.5 <noreply@anthropic.com>
Claude-Session: https://claude.ai/code/session_01WHdoH2brsuf2zg1uU5YHyB
</commit_message>
<xml_diff>
--- a/paper/manuscript_blinded.docx
+++ b/paper/manuscript_blinded.docx
@@ -126,7 +126,7 @@
           <w:sz w:val="24"/>
           <w:szCs w:val="24"/>
         </w:rPr>
-        <w:t xml:space="preserve"> Of 4,991 records, 2,481 were screened and 301 reports assessed. We included 121 reports of 118 trials (27,088 participants in 109 trials reporting numbers). Most trials (64.4%) were first reported from 2023 onwards, and 73 studied healthcare workers. Web programmes (50) and smartphone apps (21) predominated; 21 trials tested non-psychological mechanisms. Waitlist controls were used in 40.8% of trials from 2023. About half of the abstracts (58) named the burnout instrument, and 31 gave a registration number. Of 15 randomised registrations completed by 2023, 4 had no located results.</w:t>
+        <w:t xml:space="preserve"> Of 4,991 records, 2,481 were screened and 301 reports assessed. We included 120 reports of 117 trials (27,033 participants in 108 trials reporting numbers). Most trials (65.0%) were first reported from 2023 onwards, and 73 studied healthcare workers. Web programmes (49) and smartphone apps (21) predominated; 21 trials tested non-psychological mechanisms. Waitlist controls were used in 40.8% of trials from 2023. About half of the abstracts (58) named the burnout instrument, and 31 gave a registration number. Of 15 randomised registrations completed by 2023, 4 had no located results.</w:t>
       </w:r>
     </w:p>
     <w:p>
@@ -536,7 +536,7 @@
           <w:sz w:val="24"/>
           <w:szCs w:val="24"/>
         </w:rPr>
-        <w:t xml:space="preserve">The main search combined four concept blocks (burnout, digital delivery, a psychological or behavioural intervention term and randomised design) in Europe PMC, OpenAlex and ERIC (26 September 2026) and in Web of Science and Scopus (17 September 2026). Because the eligibility criteria admitted any mechanism, this strategy was too narrow. We therefore repeated the search without the intervention block (Europe PMC and OpenAlex, 28 September; Web of Science and Scopus, 29 September 2026), searched PubMed with the Medical Subject Heading "Burnout, Professional" and added further delivery terms (29 September 2026). Finally, on 18 October 2026, we ran one unified strategy (burnout AND any digital-delivery term AND randomised design) in Europe PMC and ERIC (all years) and, for records published from 1 September 2026, in OpenAlex and PubMed. Web of Science and Scopus were not searched again after 29 September 2026. ClinicalTrials.gov was searched on 28 September 2026 for completed interventional registrations with burnout as a condition and a digital term. We did not search PsycINFO, Embase or the Cochrane Central Register of Controlled Trials (no access). We checked the reference lists of five earlier reviews; none led to a further eligible trial (Supplementary Section S2). A unified Europe PMC search alone retrieved 81 of the 121 included reports (67%), so no single database was sufficient. Complete strings, dates and numbers of records are in Supplementary Appendix A and Table S2.</w:t>
+        <w:t xml:space="preserve">The main search combined four concept blocks (burnout, digital delivery, a psychological or behavioural intervention term and randomised design) in Europe PMC, OpenAlex and ERIC (26 September 2026) and in Web of Science and Scopus (17 September 2026). Because the eligibility criteria admitted any mechanism, this strategy was too narrow. We therefore repeated the search without the intervention block (Europe PMC and OpenAlex, 28 September; Web of Science and Scopus, 29 September 2026), searched PubMed with the Medical Subject Heading "Burnout, Professional" and added further delivery terms (29 September 2026). Finally, on 18 October 2026, we ran one unified strategy (burnout AND any digital-delivery term AND randomised design) in Europe PMC and ERIC (all years) and, for records published from 1 September 2026, in OpenAlex and PubMed. Web of Science and Scopus were not searched again after 29 September 2026. ClinicalTrials.gov was searched on 28 September 2026 for completed interventional registrations with burnout as a condition and a digital term. We did not search PsycINFO, Embase or the Cochrane Central Register of Controlled Trials (no access). We checked the reference lists of five earlier reviews; none led to a further eligible trial (Supplementary Section S2). A unified Europe PMC search alone retrieved 80 of the 120 included reports (67%), so no single database was sufficient. Complete strings, dates and numbers of records are in Supplementary Appendix A and Table S2.</w:t>
       </w:r>
     </w:p>
     <w:p>
@@ -617,7 +617,7 @@
           <w:sz w:val="24"/>
           <w:szCs w:val="24"/>
         </w:rPr>
-        <w:t xml:space="preserve">Each trial was charted with one value per variable: occupational group, delivery mode, intervention approach and mechanism, comparator, human support, burnout instrument, participants (randomised, or analysed where only that was reported) and year of first report. Two heterogeneous groups ("other psychological" approaches and "employees in other sectors") were split by rules written before recoding, and all their trials were recoded with the same rules. Where the abstract did not name the instrument, we took it from the full text; four trials stayed undetermined. Two further variables were coded from abstracts only and are descriptive: five reporting indicators (named randomisation method, blinding statement, attrition numbers, registration number and analysis population), each recorded as stated or not stated in the abstract, and the direction of the burnout result as reported by the authors (six categories). They are neither quality ratings nor effect estimates, and an indicator missing from an abstract does not show that the procedure was omitted. The human reviewer coded a random 20% sample (23 of the 113 trials included at that stage) blind to the first coding. The rules that the comparison exposed (a randomisation method counts only if named; "favours the intervention" requires a benefit on the total score or on every dimension reported) were then applied to all trials.</w:t>
+        <w:t xml:space="preserve">Each trial was charted with one value per variable: occupational group, delivery mode, intervention approach and mechanism, comparator, human support, burnout instrument, participants (randomised, or analysed where only that was reported) and year of first report. Two heterogeneous groups ("other psychological" approaches and "employees in other sectors") were split by rules written before recoding, and all their trials were recoded with the same rules. Where the abstract did not name the instrument, we took it from the full text; two trials stayed undetermined. Two further variables were coded from abstracts only and are descriptive: five reporting indicators (named randomisation method, blinding statement, attrition numbers, registration number and analysis population), each recorded as stated or not stated in the abstract, and the direction of the burnout result as reported by the authors (six categories). They are neither quality ratings nor effect estimates, and an indicator missing from an abstract does not show that the procedure was omitted. The human reviewer coded a random 20% sample (23 of the 113 trials included at that stage) blind to the first coding. The rules that the comparison exposed (a randomisation method counts only if named; "favours the intervention" requires a benefit on the total score or on every dimension reported) were then applied to all trials.</w:t>
       </w:r>
     </w:p>
     <w:p>
@@ -729,7 +729,7 @@
           <w:sz w:val="24"/>
           <w:szCs w:val="24"/>
         </w:rPr>
-        <w:t xml:space="preserve">The searches identified 4,991 records; 2,510 duplicates and non-article records were removed and 2,481 records were screened. Of 279 reports assessed from the databases, 160 were excluded (26 were not primary reports, 22 were not randomised, 41 did not study workers, 33 were not digitally delivered, 38 did not report burnout as an outcome); 119 were included, and the registry added 2 (Figure 1). In total, 121 reports of 118 trials were included. The searches added after the main search found 31 of the 118 trials (26.3%), 12 of them with non-psychological mechanisms, among them the ambient AI scribe trials. The random sample of 45 excluded records contained no eligible report (0 of 45; exact 95% confidence interval 0% to 7.9%). In the blind comparison of 30 reports the reviewers agreed on 24 (80%; kappa 0.60, 95% confidence interval 0.31 to 0.89); if the two partly digital interventions were counted as excluded, agreement was 73% (kappa 0.47).</w:t>
+        <w:t xml:space="preserve">The searches identified 4,991 records; 2,510 duplicates and non-article records were removed and 2,481 records were screened. Of 279 reports assessed from the databases, 161 were excluded (26 were not primary reports, 22 were not randomised, 41 did not study workers, 33 were not digitally delivered, 39 did not report burnout as an outcome); 118 were included, and the registry added 2 (Figure 1). In total, 120 reports of 117 trials were included. The searches added after the main search found 30 of the 117 trials (25.6%), 12 of them with non-psychological mechanisms, among them the ambient AI scribe trials. The random sample of 45 excluded records contained no eligible report (0 of 45; exact 95% confidence interval 0% to 7.9%). In the blind comparison of 30 reports the reviewers agreed on 24 (80%; kappa 0.60, 95% confidence interval 0.31 to 0.89); if the two partly digital interventions were counted as excluded, agreement was 73% (kappa 0.47).</w:t>
       </w:r>
     </w:p>
     <w:p>
@@ -799,7 +799,7 @@
           <w:sz w:val="24"/>
           <w:szCs w:val="24"/>
         </w:rPr>
-        <w:t xml:space="preserve"> PRISMA 2020 flow diagram. Reports are the unit of counting up to the final box; the included reports belong to 118 trials.</w:t>
+        <w:t xml:space="preserve"> PRISMA 2020 flow diagram. Reports are the unit of counting up to the final box; the included reports belong to 117 trials.</w:t>
       </w:r>
     </w:p>
     <w:p>
@@ -831,7 +831,7 @@
           <w:sz w:val="24"/>
           <w:szCs w:val="24"/>
         </w:rPr>
-        <w:t xml:space="preserve">Table 1 summarises the 118 trials (Supplementary Appendix C). The 109 trials that reported sample size enrolled 27,088 participants (median 109, interquartile range 66-228). The number was randomised or enrolled in 73 of these trials (median 125; 19,787 participants), analysed or completed in 6, and its basis could not be identified from the abstract in 30. Healthcare workers were studied in 73 (61.9%) trials, mental-health and social-care professionals in 7, teachers in 16 and employees of other sectors in 22. Of the trials, 76 (64.4%) were first reported from 2023 onwards (Figure 2); the share studying healthcare workers rose from 23.5% before 2020 to 72.0% in 2020-2022 and 67.1% from 2023, and live online group sessions, absent before 2020, were used in 23 trials from 2023. Web programmes (50 trials) and smartphone apps (21) were the commonest delivery modes. Mindfulness was the most frequent psychological approach (24 trials), and all 6 coaching trials were in physicians (Figure 3).</w:t>
+        <w:t xml:space="preserve">Table 1 summarises the 117 trials (Supplementary Appendix C). The 108 trials that reported sample size enrolled 27,033 participants (median 110, interquartile range 66-232). The number was randomised or enrolled in 73 of these trials (median 125; 19,787 participants), analysed or completed in 6, and its basis could not be identified from the abstract in 29. Healthcare workers were studied in 73 (62.4%) trials, mental-health and social-care professionals in 7, teachers in 16 and employees of other sectors in 21. Of the trials, 76 (65.0%) were first reported from 2023 onwards (Figure 2); the share studying healthcare workers rose from 25.0% before 2020 to 72.0% in 2020-2022 and 67.1% from 2023, and live online group sessions, absent before 2020, were used in 23 trials from 2023. Web programmes (49 trials) and smartphone apps (21) were the commonest delivery modes. Mindfulness was the most frequent psychological approach (24 trials), and all 6 coaching trials were in physicians (Figure 3).</w:t>
       </w:r>
     </w:p>
     <w:p>
@@ -855,7 +855,7 @@
           <w:sz w:val="24"/>
           <w:szCs w:val="24"/>
         </w:rPr>
-        <w:t xml:space="preserve"> Characteristics of the included trials (n = 118)</w:t>
+        <w:t xml:space="preserve"> Characteristics of the included trials (n = 117)</w:t>
       </w:r>
     </w:p>
     <w:tbl>
@@ -1072,7 +1072,7 @@
                 <w:sz w:val="18"/>
                 <w:szCs w:val="18"/>
               </w:rPr>
-              <w:t xml:space="preserve">17 (14.4%)</w:t>
+              <w:t xml:space="preserve">16 (13.7%)</w:t>
             </w:r>
           </w:p>
         </w:tc>
@@ -1138,7 +1138,7 @@
                 <w:sz w:val="18"/>
                 <w:szCs w:val="18"/>
               </w:rPr>
-              <w:t xml:space="preserve">25 (21.2%)</w:t>
+              <w:t xml:space="preserve">25 (21.4%)</w:t>
             </w:r>
           </w:p>
         </w:tc>
@@ -1204,7 +1204,7 @@
                 <w:sz w:val="18"/>
                 <w:szCs w:val="18"/>
               </w:rPr>
-              <w:t xml:space="preserve">76 (64.4%)</w:t>
+              <w:t xml:space="preserve">76 (65.0%)</w:t>
             </w:r>
           </w:p>
         </w:tc>
@@ -1336,7 +1336,7 @@
                 <w:sz w:val="18"/>
                 <w:szCs w:val="18"/>
               </w:rPr>
-              <w:t xml:space="preserve">35 (29.7%)</w:t>
+              <w:t xml:space="preserve">35 (29.9%)</w:t>
             </w:r>
           </w:p>
         </w:tc>
@@ -1402,7 +1402,7 @@
                 <w:sz w:val="18"/>
                 <w:szCs w:val="18"/>
               </w:rPr>
-              <w:t xml:space="preserve">22 (18.6%)</w:t>
+              <w:t xml:space="preserve">22 (18.8%)</w:t>
             </w:r>
           </w:p>
         </w:tc>
@@ -1468,7 +1468,7 @@
                 <w:sz w:val="18"/>
                 <w:szCs w:val="18"/>
               </w:rPr>
-              <w:t xml:space="preserve">16 (13.6%)</w:t>
+              <w:t xml:space="preserve">16 (13.7%)</w:t>
             </w:r>
           </w:p>
         </w:tc>
@@ -1534,7 +1534,7 @@
                 <w:sz w:val="18"/>
                 <w:szCs w:val="18"/>
               </w:rPr>
-              <w:t xml:space="preserve">16 (13.6%)</w:t>
+              <w:t xml:space="preserve">16 (13.7%)</w:t>
             </w:r>
           </w:p>
         </w:tc>
@@ -1600,7 +1600,7 @@
                 <w:sz w:val="18"/>
                 <w:szCs w:val="18"/>
               </w:rPr>
-              <w:t xml:space="preserve">9 (7.6%)</w:t>
+              <w:t xml:space="preserve">8 (6.8%)</w:t>
             </w:r>
           </w:p>
         </w:tc>
@@ -1732,7 +1732,7 @@
                 <w:sz w:val="18"/>
                 <w:szCs w:val="18"/>
               </w:rPr>
-              <w:t xml:space="preserve">7 (5.9%)</w:t>
+              <w:t xml:space="preserve">7 (6.0%)</w:t>
             </w:r>
           </w:p>
         </w:tc>
@@ -1798,7 +1798,7 @@
                 <w:sz w:val="18"/>
                 <w:szCs w:val="18"/>
               </w:rPr>
-              <w:t xml:space="preserve">5 (4.2%)</w:t>
+              <w:t xml:space="preserve">5 (4.3%)</w:t>
             </w:r>
           </w:p>
         </w:tc>
@@ -1930,7 +1930,7 @@
                 <w:sz w:val="18"/>
                 <w:szCs w:val="18"/>
               </w:rPr>
-              <w:t xml:space="preserve">50 (42.4%)</w:t>
+              <w:t xml:space="preserve">49 (41.9%)</w:t>
             </w:r>
           </w:p>
         </w:tc>
@@ -1996,7 +1996,7 @@
                 <w:sz w:val="18"/>
                 <w:szCs w:val="18"/>
               </w:rPr>
-              <w:t xml:space="preserve">25 (21.2%)</w:t>
+              <w:t xml:space="preserve">25 (21.4%)</w:t>
             </w:r>
           </w:p>
         </w:tc>
@@ -2062,7 +2062,7 @@
                 <w:sz w:val="18"/>
                 <w:szCs w:val="18"/>
               </w:rPr>
-              <w:t xml:space="preserve">21 (17.8%)</w:t>
+              <w:t xml:space="preserve">21 (17.9%)</w:t>
             </w:r>
           </w:p>
         </w:tc>
@@ -2128,7 +2128,7 @@
                 <w:sz w:val="18"/>
                 <w:szCs w:val="18"/>
               </w:rPr>
-              <w:t xml:space="preserve">9 (7.6%)</w:t>
+              <w:t xml:space="preserve">9 (7.7%)</w:t>
             </w:r>
           </w:p>
         </w:tc>
@@ -2194,7 +2194,7 @@
                 <w:sz w:val="18"/>
                 <w:szCs w:val="18"/>
               </w:rPr>
-              <w:t xml:space="preserve">5 (4.2%)</w:t>
+              <w:t xml:space="preserve">5 (4.3%)</w:t>
             </w:r>
           </w:p>
         </w:tc>
@@ -2326,7 +2326,7 @@
                 <w:sz w:val="18"/>
                 <w:szCs w:val="18"/>
               </w:rPr>
-              <w:t xml:space="preserve">3 (2.5%)</w:t>
+              <w:t xml:space="preserve">3 (2.6%)</w:t>
             </w:r>
           </w:p>
         </w:tc>
@@ -2392,7 +2392,7 @@
                 <w:sz w:val="18"/>
                 <w:szCs w:val="18"/>
               </w:rPr>
-              <w:t xml:space="preserve">1 (0.8%)</w:t>
+              <w:t xml:space="preserve">1 (0.9%)</w:t>
             </w:r>
           </w:p>
         </w:tc>
@@ -2524,7 +2524,7 @@
                 <w:sz w:val="18"/>
                 <w:szCs w:val="18"/>
               </w:rPr>
-              <w:t xml:space="preserve">24 (20.3%)</w:t>
+              <w:t xml:space="preserve">24 (20.5%)</w:t>
             </w:r>
           </w:p>
         </w:tc>
@@ -2590,7 +2590,7 @@
                 <w:sz w:val="18"/>
                 <w:szCs w:val="18"/>
               </w:rPr>
-              <w:t xml:space="preserve">21 (17.8%)</w:t>
+              <w:t xml:space="preserve">21 (17.9%)</w:t>
             </w:r>
           </w:p>
         </w:tc>
@@ -2656,7 +2656,7 @@
                 <w:sz w:val="18"/>
                 <w:szCs w:val="18"/>
               </w:rPr>
-              <w:t xml:space="preserve">13 (11.0%)</w:t>
+              <w:t xml:space="preserve">13 (11.1%)</w:t>
             </w:r>
           </w:p>
         </w:tc>
@@ -2722,7 +2722,7 @@
                 <w:sz w:val="18"/>
                 <w:szCs w:val="18"/>
               </w:rPr>
-              <w:t xml:space="preserve">12 (10.2%)</w:t>
+              <w:t xml:space="preserve">12 (10.3%)</w:t>
             </w:r>
           </w:p>
         </w:tc>
@@ -2788,7 +2788,7 @@
                 <w:sz w:val="18"/>
                 <w:szCs w:val="18"/>
               </w:rPr>
-              <w:t xml:space="preserve">9 (7.6%)</w:t>
+              <w:t xml:space="preserve">9 (7.7%)</w:t>
             </w:r>
           </w:p>
         </w:tc>
@@ -2854,7 +2854,7 @@
                 <w:sz w:val="18"/>
                 <w:szCs w:val="18"/>
               </w:rPr>
-              <w:t xml:space="preserve">7 (5.9%)</w:t>
+              <w:t xml:space="preserve">7 (6.0%)</w:t>
             </w:r>
           </w:p>
         </w:tc>
@@ -3020,7 +3020,7 @@
                 <w:sz w:val="18"/>
                 <w:szCs w:val="18"/>
               </w:rPr>
-              <w:t xml:space="preserve">    Tailored, combined or other multicomponent psychological</w:t>
+              <w:t xml:space="preserve">    Compassion-based</w:t>
             </w:r>
           </w:p>
         </w:tc>
@@ -3052,7 +3052,7 @@
                 <w:sz w:val="18"/>
                 <w:szCs w:val="18"/>
               </w:rPr>
-              <w:t xml:space="preserve">6 (5.1%)</w:t>
+              <w:t xml:space="preserve">5 (4.3%)</w:t>
             </w:r>
           </w:p>
         </w:tc>
@@ -3086,7 +3086,7 @@
                 <w:sz w:val="18"/>
                 <w:szCs w:val="18"/>
               </w:rPr>
-              <w:t xml:space="preserve">    Compassion-based</w:t>
+              <w:t xml:space="preserve">    Tailored, combined or other multicomponent psychological</w:t>
             </w:r>
           </w:p>
         </w:tc>
@@ -3118,7 +3118,7 @@
                 <w:sz w:val="18"/>
                 <w:szCs w:val="18"/>
               </w:rPr>
-              <w:t xml:space="preserve">5 (4.2%)</w:t>
+              <w:t xml:space="preserve">5 (4.3%)</w:t>
             </w:r>
           </w:p>
         </w:tc>
@@ -3316,7 +3316,7 @@
                 <w:sz w:val="18"/>
                 <w:szCs w:val="18"/>
               </w:rPr>
-              <w:t xml:space="preserve">1 (0.8%)</w:t>
+              <w:t xml:space="preserve">1 (0.9%)</w:t>
             </w:r>
           </w:p>
         </w:tc>
@@ -3448,7 +3448,7 @@
                 <w:sz w:val="18"/>
                 <w:szCs w:val="18"/>
               </w:rPr>
-              <w:t xml:space="preserve">97 (82.2%)</w:t>
+              <w:t xml:space="preserve">96 (82.1%)</w:t>
             </w:r>
           </w:p>
         </w:tc>
@@ -3514,7 +3514,7 @@
                 <w:sz w:val="18"/>
                 <w:szCs w:val="18"/>
               </w:rPr>
-              <w:t xml:space="preserve">9 (7.6%)</w:t>
+              <w:t xml:space="preserve">9 (7.7%)</w:t>
             </w:r>
           </w:p>
         </w:tc>
@@ -3646,7 +3646,7 @@
                 <w:sz w:val="18"/>
                 <w:szCs w:val="18"/>
               </w:rPr>
-              <w:t xml:space="preserve">3 (2.5%)</w:t>
+              <w:t xml:space="preserve">3 (2.6%)</w:t>
             </w:r>
           </w:p>
         </w:tc>
@@ -3712,7 +3712,7 @@
                 <w:sz w:val="18"/>
                 <w:szCs w:val="18"/>
               </w:rPr>
-              <w:t xml:space="preserve">3 (2.5%)</w:t>
+              <w:t xml:space="preserve">3 (2.6%)</w:t>
             </w:r>
           </w:p>
         </w:tc>
@@ -3844,7 +3844,7 @@
                 <w:sz w:val="18"/>
                 <w:szCs w:val="18"/>
               </w:rPr>
-              <w:t xml:space="preserve">39 (33.1%)</w:t>
+              <w:t xml:space="preserve">38 (32.5%)</w:t>
             </w:r>
           </w:p>
         </w:tc>
@@ -3910,7 +3910,7 @@
                 <w:sz w:val="18"/>
                 <w:szCs w:val="18"/>
               </w:rPr>
-              <w:t xml:space="preserve">32 (27.1%)</w:t>
+              <w:t xml:space="preserve">32 (27.4%)</w:t>
             </w:r>
           </w:p>
         </w:tc>
@@ -3976,7 +3976,7 @@
                 <w:sz w:val="18"/>
                 <w:szCs w:val="18"/>
               </w:rPr>
-              <w:t xml:space="preserve">27 (22.9%)</w:t>
+              <w:t xml:space="preserve">27 (23.1%)</w:t>
             </w:r>
           </w:p>
         </w:tc>
@@ -4042,7 +4042,7 @@
                 <w:sz w:val="18"/>
                 <w:szCs w:val="18"/>
               </w:rPr>
-              <w:t xml:space="preserve">12 (10.2%)</w:t>
+              <w:t xml:space="preserve">12 (10.3%)</w:t>
             </w:r>
           </w:p>
         </w:tc>
@@ -4208,7 +4208,7 @@
                 <w:sz w:val="18"/>
                 <w:szCs w:val="18"/>
               </w:rPr>
-              <w:t xml:space="preserve">    Human-supported or facilitated</w:t>
+              <w:t xml:space="preserve">    Self-guided or automated</w:t>
             </w:r>
           </w:p>
         </w:tc>
@@ -4240,7 +4240,7 @@
                 <w:sz w:val="18"/>
                 <w:szCs w:val="18"/>
               </w:rPr>
-              <w:t xml:space="preserve">50 (42.4%)</w:t>
+              <w:t xml:space="preserve">50 (42.7%)</w:t>
             </w:r>
           </w:p>
         </w:tc>
@@ -4274,7 +4274,7 @@
                 <w:sz w:val="18"/>
                 <w:szCs w:val="18"/>
               </w:rPr>
-              <w:t xml:space="preserve">    Self-guided or automated</w:t>
+              <w:t xml:space="preserve">    Human-supported or facilitated</w:t>
             </w:r>
           </w:p>
         </w:tc>
@@ -4306,7 +4306,7 @@
                 <w:sz w:val="18"/>
                 <w:szCs w:val="18"/>
               </w:rPr>
-              <w:t xml:space="preserve">50 (42.4%)</w:t>
+              <w:t xml:space="preserve">49 (41.9%)</w:t>
             </w:r>
           </w:p>
         </w:tc>
@@ -4372,7 +4372,7 @@
                 <w:sz w:val="18"/>
                 <w:szCs w:val="18"/>
               </w:rPr>
-              <w:t xml:space="preserve">18 (15.3%)</w:t>
+              <w:t xml:space="preserve">18 (15.4%)</w:t>
             </w:r>
           </w:p>
         </w:tc>
@@ -4504,7 +4504,7 @@
                 <w:sz w:val="18"/>
                 <w:szCs w:val="18"/>
               </w:rPr>
-              <w:t xml:space="preserve">63 (53.4%)</w:t>
+              <w:t xml:space="preserve">64 (54.7%)</w:t>
             </w:r>
           </w:p>
         </w:tc>
@@ -4570,7 +4570,7 @@
                 <w:sz w:val="18"/>
                 <w:szCs w:val="18"/>
               </w:rPr>
-              <w:t xml:space="preserve">13 (11.0%)</w:t>
+              <w:t xml:space="preserve">13 (11.1%)</w:t>
             </w:r>
           </w:p>
         </w:tc>
@@ -4702,7 +4702,7 @@
                 <w:sz w:val="18"/>
                 <w:szCs w:val="18"/>
               </w:rPr>
-              <w:t xml:space="preserve">7 (5.9%)</w:t>
+              <w:t xml:space="preserve">7 (6.0%)</w:t>
             </w:r>
           </w:p>
         </w:tc>
@@ -4834,7 +4834,7 @@
                 <w:sz w:val="18"/>
                 <w:szCs w:val="18"/>
               </w:rPr>
-              <w:t xml:space="preserve">5 (4.2%)</w:t>
+              <w:t xml:space="preserve">5 (4.3%)</w:t>
             </w:r>
           </w:p>
         </w:tc>
@@ -5032,7 +5032,7 @@
                 <w:sz w:val="18"/>
                 <w:szCs w:val="18"/>
               </w:rPr>
-              <w:t xml:space="preserve">1 (0.8%)</w:t>
+              <w:t xml:space="preserve">1 (0.9%)</w:t>
             </w:r>
           </w:p>
         </w:tc>
@@ -5098,7 +5098,7 @@
                 <w:sz w:val="18"/>
                 <w:szCs w:val="18"/>
               </w:rPr>
-              <w:t xml:space="preserve">1 (0.8%)</w:t>
+              <w:t xml:space="preserve">1 (0.9%)</w:t>
             </w:r>
           </w:p>
         </w:tc>
@@ -5164,7 +5164,7 @@
                 <w:sz w:val="18"/>
                 <w:szCs w:val="18"/>
               </w:rPr>
-              <w:t xml:space="preserve">1 (0.8%)</w:t>
+              <w:t xml:space="preserve">1 (0.9%)</w:t>
             </w:r>
           </w:p>
         </w:tc>
@@ -5230,7 +5230,7 @@
                 <w:sz w:val="18"/>
                 <w:szCs w:val="18"/>
               </w:rPr>
-              <w:t xml:space="preserve">1 (0.8%)</w:t>
+              <w:t xml:space="preserve">1 (0.9%)</w:t>
             </w:r>
           </w:p>
         </w:tc>
@@ -5296,7 +5296,7 @@
                 <w:sz w:val="18"/>
                 <w:szCs w:val="18"/>
               </w:rPr>
-              <w:t xml:space="preserve">1 (0.8%)</w:t>
+              <w:t xml:space="preserve">1 (0.9%)</w:t>
             </w:r>
           </w:p>
         </w:tc>
@@ -5362,7 +5362,7 @@
                 <w:sz w:val="18"/>
                 <w:szCs w:val="18"/>
               </w:rPr>
-              <w:t xml:space="preserve">1 (0.8%)</w:t>
+              <w:t xml:space="preserve">1 (0.9%)</w:t>
             </w:r>
           </w:p>
         </w:tc>
@@ -5428,7 +5428,7 @@
                 <w:sz w:val="18"/>
                 <w:szCs w:val="18"/>
               </w:rPr>
-              <w:t xml:space="preserve">4 (3.4%)</w:t>
+              <w:t xml:space="preserve">2 (1.7%)</w:t>
             </w:r>
           </w:p>
         </w:tc>
@@ -5527,7 +5527,7 @@
           <w:sz w:val="24"/>
           <w:szCs w:val="24"/>
         </w:rPr>
-        <w:t xml:space="preserve"> Included trials by year of first report and main delivery mode (n = 118). Data for 2026 cover 1 January to 18 October 2026.</w:t>
+        <w:t xml:space="preserve"> Included trials by year of first report and main delivery mode (n = 117). Data for 2026 cover 1 January to 18 October 2026.</w:t>
       </w:r>
     </w:p>
     <w:p>
@@ -5597,7 +5597,7 @@
           <w:sz w:val="24"/>
           <w:szCs w:val="24"/>
         </w:rPr>
-        <w:t xml:space="preserve"> Evidence map: trials by occupational group and intervention approach (n = 118); totals in parentheses, dots mark empty cells.</w:t>
+        <w:t xml:space="preserve"> Evidence map: trials by occupational group and intervention approach (n = 117); totals in parentheses, dots mark empty cells.</w:t>
       </w:r>
     </w:p>
     <w:p>
@@ -5629,7 +5629,7 @@
           <w:sz w:val="24"/>
           <w:szCs w:val="24"/>
         </w:rPr>
-        <w:t xml:space="preserve">A mechanism that was not psychological was tested in 21 trials (17.8%): professional training (9), physical activity or health behaviour (6), feedback or navigation (3) and workflow automation (3, all ambient AI scribes for physicians). Of these, 12 were found only by the searches added after the main search. A waitlist or delayed-access comparator was used in 39 (33.1%) trials, an active or attention control in 32 (27.1%) and usual practice in 27 (22.9%); waitlists rose from 19.0% of trials before 2023 to 40.8% from 2023 (Table 2). Self-guided or automated interventions (50) and human-supported interventions (50) were equally common; support depended on delivery mode (24 of 25 live programmes were facilitated, 20 of 21 apps self-guided).</w:t>
+        <w:t xml:space="preserve">A mechanism that was not psychological was tested in 21 trials (17.9%): professional training (9), physical activity or health behaviour (6), feedback or navigation (3) and workflow automation (3, all ambient AI scribes for physicians). Of these, 12 were found only by the searches added after the main search. A waitlist or delayed-access comparator was used in 38 (32.5%) trials, an active or attention control in 32 (27.4%) and usual practice in 27 (23.1%); waitlists rose from 17.1% of trials before 2023 to 40.8% from 2023 (Table 2). Self-guided or automated interventions (50) and human-supported interventions (49) were equally common; support depended on delivery mode (24 of 25 live programmes were facilitated, 20 of 21 apps self-guided).</w:t>
       </w:r>
     </w:p>
     <w:p>
@@ -5906,7 +5906,7 @@
                 <w:sz w:val="18"/>
                 <w:szCs w:val="18"/>
               </w:rPr>
-              <w:t xml:space="preserve">17</w:t>
+              <w:t xml:space="preserve">16</w:t>
             </w:r>
           </w:p>
         </w:tc>
@@ -6002,7 +6002,7 @@
                 <w:sz w:val="18"/>
                 <w:szCs w:val="18"/>
               </w:rPr>
-              <w:t xml:space="preserve">118</w:t>
+              <w:t xml:space="preserve">117</w:t>
             </w:r>
           </w:p>
         </w:tc>
@@ -6068,7 +6068,7 @@
                 <w:sz w:val="18"/>
                 <w:szCs w:val="18"/>
               </w:rPr>
-              <w:t xml:space="preserve">95</w:t>
+              <w:t xml:space="preserve">101</w:t>
             </w:r>
           </w:p>
         </w:tc>
@@ -6164,7 +6164,7 @@
                 <w:sz w:val="18"/>
                 <w:szCs w:val="18"/>
               </w:rPr>
-              <w:t xml:space="preserve">109</w:t>
+              <w:t xml:space="preserve">110</w:t>
             </w:r>
           </w:p>
         </w:tc>
@@ -6230,7 +6230,7 @@
                 <w:sz w:val="18"/>
                 <w:szCs w:val="18"/>
               </w:rPr>
-              <w:t xml:space="preserve">23.5</w:t>
+              <w:t xml:space="preserve">25.0</w:t>
             </w:r>
           </w:p>
         </w:tc>
@@ -6326,7 +6326,7 @@
                 <w:sz w:val="18"/>
                 <w:szCs w:val="18"/>
               </w:rPr>
-              <w:t xml:space="preserve">61.9</w:t>
+              <w:t xml:space="preserve">62.4</w:t>
             </w:r>
           </w:p>
         </w:tc>
@@ -6392,7 +6392,7 @@
                 <w:sz w:val="18"/>
                 <w:szCs w:val="18"/>
               </w:rPr>
-              <w:t xml:space="preserve">29.4</w:t>
+              <w:t xml:space="preserve">25.0</w:t>
             </w:r>
           </w:p>
         </w:tc>
@@ -6488,7 +6488,7 @@
                 <w:sz w:val="18"/>
                 <w:szCs w:val="18"/>
               </w:rPr>
-              <w:t xml:space="preserve">33.1</w:t>
+              <w:t xml:space="preserve">32.5</w:t>
             </w:r>
           </w:p>
         </w:tc>
@@ -6554,7 +6554,7 @@
                 <w:sz w:val="18"/>
                 <w:szCs w:val="18"/>
               </w:rPr>
-              <w:t xml:space="preserve">35.3</w:t>
+              <w:t xml:space="preserve">37.5</w:t>
             </w:r>
           </w:p>
         </w:tc>
@@ -6650,7 +6650,7 @@
                 <w:sz w:val="18"/>
                 <w:szCs w:val="18"/>
               </w:rPr>
-              <w:t xml:space="preserve">27.1</w:t>
+              <w:t xml:space="preserve">27.4</w:t>
             </w:r>
           </w:p>
         </w:tc>
@@ -6716,7 +6716,7 @@
                 <w:sz w:val="18"/>
                 <w:szCs w:val="18"/>
               </w:rPr>
-              <w:t xml:space="preserve">41.2</w:t>
+              <w:t xml:space="preserve">37.5</w:t>
             </w:r>
           </w:p>
         </w:tc>
@@ -6812,7 +6812,7 @@
                 <w:sz w:val="18"/>
                 <w:szCs w:val="18"/>
               </w:rPr>
-              <w:t xml:space="preserve">42.4</w:t>
+              <w:t xml:space="preserve">41.9</w:t>
             </w:r>
           </w:p>
         </w:tc>
@@ -6878,7 +6878,7 @@
                 <w:sz w:val="18"/>
                 <w:szCs w:val="18"/>
               </w:rPr>
-              <w:t xml:space="preserve">23.5</w:t>
+              <w:t xml:space="preserve">25.0</w:t>
             </w:r>
           </w:p>
         </w:tc>
@@ -6974,7 +6974,7 @@
                 <w:sz w:val="18"/>
                 <w:szCs w:val="18"/>
               </w:rPr>
-              <w:t xml:space="preserve">17.8</w:t>
+              <w:t xml:space="preserve">17.9</w:t>
             </w:r>
           </w:p>
         </w:tc>
@@ -7040,7 +7040,7 @@
                 <w:sz w:val="18"/>
                 <w:szCs w:val="18"/>
               </w:rPr>
-              <w:t xml:space="preserve">23.5</w:t>
+              <w:t xml:space="preserve">25.0</w:t>
             </w:r>
           </w:p>
         </w:tc>
@@ -7136,7 +7136,7 @@
                 <w:sz w:val="18"/>
                 <w:szCs w:val="18"/>
               </w:rPr>
-              <w:t xml:space="preserve">49.2</w:t>
+              <w:t xml:space="preserve">49.6</w:t>
             </w:r>
           </w:p>
         </w:tc>
@@ -7233,7 +7233,7 @@
           <w:sz w:val="24"/>
           <w:szCs w:val="24"/>
         </w:rPr>
-        <w:t xml:space="preserve">The burnout instrument was named in 58 (49.2%) abstracts; the full text identified it for 56 of the other 60, and 4 remained undetermined. The Maslach Burnout Inventory or an adaptation was used in 63 (53.4%) trials, followed by the Copenhagen (13) and Oldenburg (10) inventories. In the abstracts, a registration number was given in 31 (26.3%) trials, attrition or analysed numbers in 32 (27.1%), an analysis population in 17 (14.4%), blinding in 13 (11.0%) and a randomisation method in 7 (5.9%). The abstract reported a burnout result favouring the intervention in 50 (42.4%) trials, a mixed result (one subscale, subgroup, arm or time point) in 27 (22.9%), no difference in 20 (16.9%) and an unfavourable result in 2 (1.7%); 4 (3.4%) reported improvement in all arms and 15 (12.7%) stated no burnout result. These codes describe reporting and are not effect estimates (Supplementary Table S3). On the verification sample the reviewers' direction codes agreed for 17 of 23 trials (74%; kappa 0.62) and the indicator judgements for 110 of 115 (96%).</w:t>
+        <w:t xml:space="preserve">The burnout instrument was named in 58 (49.6%) abstracts; the full text identified it for 57 of the other 59, and 2 remained undetermined. The Maslach Burnout Inventory or an adaptation was used in 64 (54.7%) trials, followed by the Copenhagen (13) and Oldenburg (10) inventories. In the abstracts, a registration number was given in 31 (26.5%) trials, attrition or analysed numbers in 32 (27.4%), an analysis population in 17 (14.5%), blinding in 13 (11.1%) and a randomisation method in 7 (6.0%). The abstract reported a burnout result favouring the intervention in 50 (42.7%) trials, a mixed result (one subscale, subgroup, arm or time point) in 27 (23.1%), no difference in 20 (17.1%) and an unfavourable result in 2 (1.7%); 4 (3.4%) reported improvement in all arms and 14 (12.0%) stated no burnout result. These codes describe reporting and are not effect estimates (Supplementary Table S3). On the verification sample the reviewers' direction codes agreed for 17 of 23 trials (74%; kappa 0.62) and the indicator judgements for 110 of 115 (96%).</w:t>
       </w:r>
     </w:p>
     <w:p>
@@ -7313,7 +7313,7 @@
           <w:sz w:val="24"/>
           <w:szCs w:val="24"/>
         </w:rPr>
-        <w:t xml:space="preserve">This review identified 118 randomised trials of digitally delivered interventions that reported burnout in working populations. The evidence is recent: 64.4% of the trials were first reported from 2023 onwards, and the field changed after 2020 in who was studied and how interventions were delivered. It is concentrated in healthcare (61.9%), while teachers and employees of other sectors together contribute 32.2%. Most trials test psychological programmes that ask the individual worker to change (82.2%), whereas interventions that change training, work processes or practical conditions are a small and partly hidden part of the literature: 12 of 21 were found only by the searches without an intervention block. Design and reporting leave room for improvement: waitlist controls are common and were used in 40.8% of the most recent trials, the typical trial is small, only about half of the abstracts (49.2%) name the burnout instrument, and no results could be found for 4 of 15 registered trials completed by 2023. The rise since 2020 describes published trials, not trials started, and is compatible with, but does not show, an effect of the pandemic.</w:t>
+        <w:t xml:space="preserve">This review identified 117 randomised trials of digitally delivered interventions that reported burnout in working populations. The evidence is recent: 65.0% of the trials were first reported from 2023 onwards, and the field changed after 2020 in who was studied and how interventions were delivered. It is concentrated in healthcare (62.4%), while teachers and employees of other sectors together contribute 31.6%. Most trials test psychological programmes that ask the individual worker to change (82.1%), whereas interventions that change training, work processes or practical conditions are a small and partly hidden part of the literature: 12 of 21 were found only by the searches without an intervention block. Design and reporting leave room for improvement: waitlist controls are common and were used in 40.8% of the most recent trials, the typical trial is small, only about half of the abstracts (49.6%) name the burnout instrument, and no results could be found for 4 of 15 registered trials completed by 2023. The rise since 2020 describes published trials, not trials started, and is compatible with, but does not show, an effect of the pandemic.</w:t>
       </w:r>
     </w:p>
     <w:p>
@@ -7575,7 +7575,7 @@
           <w:sz w:val="24"/>
           <w:szCs w:val="24"/>
         </w:rPr>
-        <w:t xml:space="preserve">Randomised evidence on digital interventions for occupational burnout has grown quickly since 2020 and now comprises 118 trials, concentrated in healthcare and in psychological programmes for individual workers. Recent trials rely more often on waitlist controls, many are small pilots, and abstracts often omit the burnout instrument and basic trial features. Future trials should include workers outside healthcare, test interventions that change training and work processes, use active or usual-practice comparators, and report the instrument and the results of every completed trial.</w:t>
+        <w:t xml:space="preserve">Randomised evidence on digital interventions for occupational burnout has grown quickly since 2020 and now comprises 117 trials, concentrated in healthcare and in psychological programmes for individual workers. Recent trials rely more often on waitlist controls, many are small pilots, and abstracts often omit the burnout instrument and basic trial features. Future trials should include workers outside healthcare, test interventions that change training and work processes, use active or usual-practice comparators, and report the instrument and the results of every completed trial.</w:t>
       </w:r>
     </w:p>
     <w:p>

</xml_diff>